<commit_message>
feat: migracion completa de frontend a React 19 con Bootstrap 5.3 bajo Spec Kit
</commit_message>
<xml_diff>
--- a/INFORME_MEGASUPER.docx
+++ b/INFORME_MEGASUPER.docx
@@ -3281,7 +3281,7 @@
         <w:rPr>
           <w:lang w:val="es-CL"/>
         </w:rPr>
-        <w:t xml:space="preserve">El presente informe expone el desarrollo de SuperMarket.cl, disponible en www.supermarket.cl. Es una aplicación web que se adapta a celulares, </w:t>
+        <w:t xml:space="preserve">El presente informe expone el desarrollo de MEGASUPER.CL, disponible en www.megasuper.cl. Es una aplicación web que se adapta a celulares, </w:t>
       </w:r>
       <w:proofErr w:type="spellStart"/>
       <w:r>
@@ -3369,7 +3369,7 @@
         <w:rPr>
           <w:lang w:val="es-CL"/>
         </w:rPr>
-        <w:t>Desarrollar una aplicación web para SuperMarket.cl que reúna en un solo lugar la venta de productos de vari</w:t>
+        <w:t>Desarrollar una aplicación web para MEGASUPER.CL que reúna en un solo lugar la venta de productos de vari</w:t>
       </w:r>
       <w:r>
         <w:rPr>
@@ -3655,7 +3655,7 @@
         <w:rPr>
           <w:lang w:val="es-CL"/>
         </w:rPr>
-        <w:t>SuperMarket.cl es una plataforma web de venta en línea de vari</w:t>
+        <w:t>MEGASUPER.CL es una plataforma web de venta en línea de vari</w:t>
       </w:r>
       <w:r>
         <w:rPr>
@@ -5116,7 +5116,7 @@
         <w:rPr>
           <w:lang w:val="es-CL"/>
         </w:rPr>
-        <w:t>El negocio no cuenta con un sistema único que permita manejar en conjunto productos, ventas, pedidos, clientes y entradas y salidas de productos. Esto dificulta tener la información al día, saber qué hay disponible y hacer un buen seguimiento de las ventas de SuperMarket.cl.</w:t>
+        <w:t>El negocio no cuenta con un sistema único que permita manejar en conjunto productos, ventas, pedidos, clientes y entradas y salidas de productos. Esto dificulta tener la información al día, saber qué hay disponible y hacer un buen seguimiento de las ventas de MEGASUPER.CL.</w:t>
       </w:r>
     </w:p>
     <w:p>
@@ -5471,7 +5471,7 @@
         <w:rPr>
           <w:lang w:val="es-CL"/>
         </w:rPr>
-        <w:t>Se revisaron como referencia los supermercados en línea tradicionales, las distribuidoras mayoristas (presenciales o mixtas) y las tiendas en línea generales. SuperMarket.cl se diferencia porque reúne en un mismo lugar categorías, precios por cantidad, carrito y administración interna, con un trabajo de requisitos que permite seguir cada necesidad hasta su resultado (Sommerville, 2011).</w:t>
+        <w:t>Se revisaron como referencia los supermercados en línea tradicionales, las distribuidoras mayoristas (presenciales o mixtas) y las tiendas en línea generales. MEGASUPER.CL se diferencia porque reúne en un mismo lugar categorías, precios por cantidad, carrito y administración interna, con un trabajo de requisitos que permite seguir cada necesidad hasta su resultado (Sommerville, 2011).</w:t>
       </w:r>
     </w:p>
     <w:p>
@@ -5516,7 +5516,7 @@
         <w:rPr>
           <w:lang w:val="es-CL"/>
         </w:rPr>
-        <w:t>El problema principal es la falta de conexión, claridad y seguimiento entre la venta de productos de varias tiendas, el precio por cantidad, la orden de venta y el control de entradas y salidas de productos. SuperMarket.cl es la solución de software que busca resolver esta falta de conexión.</w:t>
+        <w:t>El problema principal es la falta de conexión, claridad y seguimiento entre la venta de productos de varias tiendas, el precio por cantidad, la orden de venta y el control de entradas y salidas de productos. MEGASUPER.CL es la solución de software que busca resolver esta falta de conexión.</w:t>
       </w:r>
     </w:p>
     <w:p>
@@ -5546,7 +5546,7 @@
         <w:rPr>
           <w:lang w:val="es-CL"/>
         </w:rPr>
-        <w:t>¿Cómo desarrollar una aplicación web que se adapte a cualquier pantalla y que reúna el catálogo de varias tiendas, las órdenes de venta, los clientes y las entradas y salidas de productos de SuperMarket.cl, con precios según la cantidad y un panel administrativo seguro que reduzca el desorden y cuide los datos?</w:t>
+        <w:t>¿Cómo desarrollar una aplicación web que se adapte a cualquier pantalla y que reúna el catálogo de varias tiendas, las órdenes de venta, los clientes y las entradas y salidas de productos de MEGASUPER.CL, con precios según la cantidad y un panel administrativo seguro que reduzca el desorden y cuide los datos?</w:t>
       </w:r>
     </w:p>
     <w:p>
@@ -11855,7 +11855,7 @@
         <w:rPr>
           <w:lang w:val="es-CL"/>
         </w:rPr>
-        <w:t xml:space="preserve"> semanales consecutivos (del 07 de septiembre al 04 de octubre de 2026), garantizando entregas iterativas e incrementales orientadas a los requerimientos del Marketplace Inteligente SuperMarket.cl. En cada Sprint se realizaron las siguientes ceremonias:</w:t>
+        <w:t xml:space="preserve"> semanales consecutivos (del 07 de septiembre al 04 de octubre de 2026), garantizando entregas iterativas e incrementales orientadas a los requerimientos del Marketplace Inteligente MEGASUPER.CL. En cada Sprint se realizaron las siguientes ceremonias:</w:t>
       </w:r>
       <w:r>
         <w:rPr>
@@ -11911,7 +11911,7 @@
         <w:rPr>
           <w:lang w:val="es-CL"/>
         </w:rPr>
-        <w:t xml:space="preserve"> &amp; Demos: Validación funcional contra los flujos de supermarket.cl (catálogo 4 en 1, carrito, precios por tramo y </w:t>
+        <w:t xml:space="preserve"> &amp; Demos: Validación funcional contra los flujos de megasuper.cl (catálogo 4 en 1, carrito, precios por tramo y </w:t>
       </w:r>
       <w:proofErr w:type="spellStart"/>
       <w:r>
@@ -11977,7 +11977,7 @@
         <w:rPr>
           <w:lang w:val="es-CL"/>
         </w:rPr>
-        <w:t>La arquitectura de SuperMarket.cl está diseñada bajo un enfoque desacoplado, modular y de alto rendimiento denominado '</w:t>
+        <w:t>La arquitectura de MEGASUPER.CL está diseñada bajo un enfoque desacoplado, modular y de alto rendimiento denominado '</w:t>
       </w:r>
       <w:proofErr w:type="spellStart"/>
       <w:r>
@@ -12174,7 +12174,7 @@
         <w:rPr>
           <w:lang w:val="es-CL"/>
         </w:rPr>
-        <w:t xml:space="preserve">Conforme a los estándares de ingeniería de software y normalización relacional en Tercera Forma Normal (3FN), el modelo entidad-relación de SuperMarket.cl desacopla la persistencia transaccional, el control de stock, la auditoría de seguridad y la trazabilidad logística. El esquema erradica de raíz las anomalías de redundancia y actualización propias de modelos no normalizados, estructurando la operación del </w:t>
+        <w:t xml:space="preserve">Conforme a los estándares de ingeniería de software y normalización relacional en Tercera Forma Normal (3FN), el modelo entidad-relación de MEGASUPER.CL desacopla la persistencia transaccional, el control de stock, la auditoría de seguridad y la trazabilidad logística. El esquema erradica de raíz las anomalías de redundancia y actualización propias de modelos no normalizados, estructurando la operación del </w:t>
       </w:r>
       <w:proofErr w:type="spellStart"/>
       <w:r>
@@ -12258,7 +12258,7 @@
           <w:i/>
           <w:lang w:val="es-CL"/>
         </w:rPr>
-        <w:t>Figura 1. Arquitectura Técnica Integrada 4 en 1 y Modelo de Datos Relacional (DER en 3FN) de SuperMarket.cl.</w:t>
+        <w:t>Figura 1. Arquitectura Técnica Integrada 4 en 1 y Modelo de Datos Relacional (DER en 3FN) de MEGASUPER.CL.</w:t>
       </w:r>
     </w:p>
     <w:p>
@@ -12467,7 +12467,7 @@
           <w:color w:val="1E293B"/>
           <w:lang w:val="es-CL"/>
         </w:rPr>
-        <w:t>A continuación se documentan formalmente las 9 entidades que sustentan la persistencia transaccional y operativa del sistema desplegado en producción (supermarket.cl), con sus campos, tipos de datos, restricciones y cardinalidades:</w:t>
+        <w:t>A continuación se documentan formalmente las 9 entidades que sustentan la persistencia transaccional y operativa del sistema desplegado en producción (megasuper.cl), con sus campos, tipos de datos, restricciones y cardinalidades:</w:t>
       </w:r>
     </w:p>
     <w:tbl>
@@ -23072,7 +23072,7 @@
                 <w:sz w:val="17"/>
                 <w:lang w:val="es-CL"/>
               </w:rPr>
-              <w:t xml:space="preserve"> Owner y equipo Scrum, quiero formular la propuesta de valor y arquitectura multitienda 4 en 1 de SuperMarket.cl, para establecer los objetivos de negocio.</w:t>
+              <w:t xml:space="preserve"> Owner y equipo Scrum, quiero formular la propuesta de valor y arquitectura multitienda 4 en 1 de MEGASUPER.CL, para establecer los objetivos de negocio.</w:t>
             </w:r>
           </w:p>
         </w:tc>
@@ -23418,7 +23418,7 @@
                 <w:sz w:val="17"/>
                 <w:lang w:val="es-CL"/>
               </w:rPr>
-              <w:t>1. Límite del Sistema formal (SuperMarket.cl). 2. Relaciones &lt;&lt;</w:t>
+              <w:t>1. Límite del Sistema formal (MEGASUPER.CL). 2. Relaciones &lt;&lt;</w:t>
             </w:r>
             <w:proofErr w:type="spellStart"/>
             <w:r>
@@ -23846,7 +23846,7 @@
                 <w:sz w:val="17"/>
                 <w:lang w:val="es-CL"/>
               </w:rPr>
-              <w:t>Como Comprador mayorista de SuperMarket.cl, quiero que el catálogo aplique automáticamente descuentos por volumen en tramos de 1, 3 y 6+ unidades, para maximizar el ahorro económico determinista.</w:t>
+              <w:t>Como Comprador mayorista de MEGASUPER.CL, quiero que el catálogo aplique automáticamente descuentos por volumen en tramos de 1, 3 y 6+ unidades, para maximizar el ahorro económico determinista.</w:t>
             </w:r>
           </w:p>
         </w:tc>
@@ -24003,7 +24003,7 @@
                 <w:sz w:val="17"/>
                 <w:lang w:val="es-CL"/>
               </w:rPr>
-              <w:t>Como Cliente de SuperMarket.cl, quiero que mi selección se preserve en el navegador y cerrar mi orden vía WhatsApp sin registro previo, para completar compras de forma inmediata y sin fricción.</w:t>
+              <w:t>Como Cliente de MEGASUPER.CL, quiero que mi selección se preserve en el navegador y cerrar mi orden vía WhatsApp sin registro previo, para completar compras de forma inmediata y sin fricción.</w:t>
             </w:r>
           </w:p>
         </w:tc>
@@ -24387,7 +24387,7 @@
                 <w:sz w:val="17"/>
                 <w:lang w:val="es-CL"/>
               </w:rPr>
-              <w:t>Como QA Lead y Equipo de Pruebas, quiero ejecutar los 13 casos de prueba de caja negra en el entorno real de www.supermarket.cl, para verificar la conformidad técnica y la ausencia de defectos críticos.</w:t>
+              <w:t>Como QA Lead y Equipo de Pruebas, quiero ejecutar los 13 casos de prueba de caja negra en el entorno real de www.megasuper.cl, para verificar la conformidad técnica y la ausencia de defectos críticos.</w:t>
             </w:r>
           </w:p>
         </w:tc>
@@ -24901,7 +24901,7 @@
                 <w:sz w:val="17"/>
                 <w:lang w:val="es-CL"/>
               </w:rPr>
-              <w:t>4. Archivo oficial MEMORANDUM_EQUIPO_SuperMarket.docx adjunto y sincronizado en Jira Cloud.</w:t>
+              <w:t>4. Archivo oficial MEMORANDUM_EQUIPO_MegaSuper.docx adjunto y sincronizado en Jira Cloud.</w:t>
             </w:r>
           </w:p>
         </w:tc>
@@ -25608,7 +25608,7 @@
                 <w:sz w:val="18"/>
                 <w:lang w:val="es-CL"/>
               </w:rPr>
-              <w:t xml:space="preserve">Alineación de propuesta de valor de supermarket.cl y definición de 4 </w:t>
+              <w:t xml:space="preserve">Alineación de propuesta de valor de megasuper.cl y definición de 4 </w:t>
             </w:r>
             <w:proofErr w:type="spellStart"/>
             <w:r>
@@ -26891,7 +26891,7 @@
           <w:sz w:val="19"/>
           <w:lang w:val="es-CL"/>
         </w:rPr>
-        <w:t xml:space="preserve">Ante la calificación preliminar de 3.0 emitida por el docente evaluador y con el objetivo de regularizar de manera estricta y verificable el descalce entre la versión previa del informe y la arquitectura operativa en producción (supermarket.cl), la Dirección del Proyecto y </w:t>
+        <w:t xml:space="preserve">Ante la calificación preliminar de 3.0 emitida por el docente evaluador y con el objetivo de regularizar de manera estricta y verificable el descalce entre la versión previa del informe y la arquitectura operativa en producción (megasuper.cl), la Dirección del Proyecto y </w:t>
       </w:r>
       <w:proofErr w:type="spellStart"/>
       <w:r>
@@ -27909,7 +27909,7 @@
                 <w:sz w:val="16"/>
                 <w:lang w:val="es-CL"/>
               </w:rPr>
-              <w:t xml:space="preserve"> completas sobre la plataforma www.supermarket.cl.</w:t>
+              <w:t xml:space="preserve"> completas sobre la plataforma www.megasuper.cl.</w:t>
             </w:r>
             <w:r>
               <w:rPr>
@@ -28170,7 +28170,7 @@
           <w:lang w:val="es-CL"/>
         </w:rPr>
         <w:br/>
-        <w:t>• Alineación con el Sistema Real: Toda documentación responde estrictamente al comportamiento real y verificable de www.supermarket.cl. Quedan descartados todos los diagramas y textos preliminares que no representen el software en producción.</w:t>
+        <w:t>• Alineación con el Sistema Real: Toda documentación responde estrictamente al comportamiento real y verificable de www.megasuper.cl. Quedan descartados todos los diagramas y textos preliminares que no representen el software en producción.</w:t>
       </w:r>
       <w:r>
         <w:rPr>
@@ -28259,7 +28259,7 @@
           <w:lang w:val="es-CL"/>
         </w:rPr>
         <w:br/>
-        <w:t>SuperMarket.cl</w:t>
+        <w:t>MEGASUPER.CL</w:t>
       </w:r>
     </w:p>
     <w:p>
@@ -33716,7 +33716,7 @@
         <w:rPr>
           <w:lang w:val="es-CL"/>
         </w:rPr>
-        <w:t xml:space="preserve">A continuación se presenta la Carta Gantt detallada y definitiva de SuperMarket.cl, desglosada día por día a través de las cuatro semanas de calendario correspondientes a los </w:t>
+        <w:t xml:space="preserve">A continuación se presenta la Carta Gantt detallada y definitiva de MEGASUPER.CL, desglosada día por día a través de las cuatro semanas de calendario correspondientes a los </w:t>
       </w:r>
       <w:proofErr w:type="spellStart"/>
       <w:r>
@@ -41009,7 +41009,7 @@
                 <w:sz w:val="17"/>
                 <w:lang w:val="es-CL"/>
               </w:rPr>
-              <w:t>Sección 12.1.3 y MEMORANDUM_EQUIPO_SuperMarket.docx</w:t>
+              <w:t>Sección 12.1.3 y MEMORANDUM_EQUIPO_MegaSuper.docx</w:t>
             </w:r>
           </w:p>
         </w:tc>
@@ -42134,7 +42134,7 @@
                 <w:color w:val="222222"/>
                 <w:sz w:val="18"/>
               </w:rPr>
-              <w:t>https://supermarket.cl/</w:t>
+              <w:t>https://megasuper.cl/</w:t>
             </w:r>
           </w:p>
         </w:tc>
@@ -42473,7 +42473,7 @@
                 <w:sz w:val="17"/>
                 <w:lang w:val="es-CL"/>
               </w:rPr>
-              <w:t>Sección 12.1.3 y archivo MEMORANDUM_EQUIPO_SuperMarket.docx</w:t>
+              <w:t>Sección 12.1.3 y archivo MEMORANDUM_EQUIPO_MegaSuper.docx</w:t>
             </w:r>
           </w:p>
         </w:tc>
@@ -42515,7 +42515,7 @@
         <w:rPr>
           <w:lang w:val="es-CL"/>
         </w:rPr>
-        <w:t>Con este proyecto logramos reunir en un solo documento lo que SuperMarket.cl necesita para partir: el problema del negocio, los requisitos, el diseño, las pruebas, los riesgos y el plan de mantenimiento. La idea fue tratar el sitio como un sistema con reglas, usuarios y datos, y no solo como una vitrina. Por eso la primera versión se concentra en lo esencial: el catálogo de vari</w:t>
+        <w:t>Con este proyecto logramos reunir en un solo documento lo que MEGASUPER.CL necesita para partir: el problema del negocio, los requisitos, el diseño, las pruebas, los riesgos y el plan de mantenimiento. La idea fue tratar el sitio como un sistema con reglas, usuarios y datos, y no solo como una vitrina. Por eso la primera versión se concentra en lo esencial: el catálogo de vari</w:t>
       </w:r>
       <w:r>
         <w:rPr>

</xml_diff>